<commit_message>
rumica-starter: add EN/RU docx exports of Vision & Scope and Architecture Specification
</commit_message>
<xml_diff>
--- a/projects/rumica-starter/docx/Vision-and-Scope-Rumica-Starter-EN.docx
+++ b/projects/rumica-starter/docx/Vision-and-Scope-Rumica-Starter-EN.docx
@@ -75,7 +75,7 @@
           <w:color w:val="444444"/>
           <w:sz w:val="21"/>
         </w:rPr>
-        <w:t>Status: Ready for evaluation</w:t>
+        <w:t>Status: Final — ready for development</w:t>
       </w:r>
     </w:p>
     <w:p>
@@ -412,7 +412,7 @@
         <w:rPr>
           <w:b/>
         </w:rPr>
-        <w:t>(a) Deferred to a later phase of Rumica</w:t>
+        <w:t>Deferred to a later phase of Rumica</w:t>
       </w:r>
       <w:r>
         <w:t xml:space="preserve"> (remain fully in-scope for the product; simply not built in Starter, and Starter is designed not to require rework when they are added):</w:t>

</xml_diff>